<commit_message>
add toon ku-lenven id to genAi
</commit_message>
<xml_diff>
--- a/20250625_GenAI_Code of conduct_AJ 2526_EN.docx
+++ b/20250625_GenAI_Code of conduct_AJ 2526_EN.docx
@@ -498,27 +498,17 @@
         </w:rPr>
         <w:t xml:space="preserve">If your master’s thesis is under </w:t>
       </w:r>
-      <w:r>
-        <w:fldChar w:fldCharType="begin"/>
-      </w:r>
-      <w:r>
-        <w:instrText>HYPERLINK "https://iiw.kuleuven.be/english/students/master-thesis/embargo" \o "https://iiw.kuleuven.be/english/students/master-thesis/embargo"</w:instrText>
-      </w:r>
-      <w:r>
-        <w:fldChar w:fldCharType="separate"/>
-      </w:r>
-      <w:r>
-        <w:rPr>
-          <w:rStyle w:val="Hyperlink"/>
-          <w:rFonts w:ascii="Calibri" w:hAnsi="Calibri" w:cs="Calibri"/>
-          <w:b/>
-          <w:lang w:val="en-GB"/>
-        </w:rPr>
-        <w:t>embargo</w:t>
-      </w:r>
-      <w:r>
-        <w:fldChar w:fldCharType="end"/>
-      </w:r>
+      <w:hyperlink r:id="rId13" w:tooltip="https://iiw.kuleuven.be/english/students/master-thesis/embargo" w:history="1">
+        <w:r>
+          <w:rPr>
+            <w:rStyle w:val="Hyperlink"/>
+            <w:rFonts w:ascii="Calibri" w:hAnsi="Calibri" w:cs="Calibri"/>
+            <w:b/>
+            <w:lang w:val="en-GB"/>
+          </w:rPr>
+          <w:t>embargo</w:t>
+        </w:r>
+      </w:hyperlink>
       <w:r>
         <w:rPr>
           <w:rFonts w:ascii="Calibri" w:hAnsi="Calibri" w:cs="Calibri"/>
@@ -553,27 +543,17 @@
         </w:rPr>
         <w:t xml:space="preserve">Before using a GenAI tool, always consider whether its use is responsible, including from a </w:t>
       </w:r>
-      <w:r>
-        <w:fldChar w:fldCharType="begin"/>
-      </w:r>
-      <w:r>
-        <w:instrText>HYPERLINK "https://www.kuleuven.be/english/genai/sustainable-and-responsible-use-of-genai" \o "https://www.kuleuven.be/english/genai/sustainable-and-responsible-use-of-genai"</w:instrText>
-      </w:r>
-      <w:r>
-        <w:fldChar w:fldCharType="separate"/>
-      </w:r>
-      <w:r>
-        <w:rPr>
-          <w:rStyle w:val="Hyperlink"/>
-          <w:rFonts w:ascii="Calibri" w:hAnsi="Calibri" w:cs="Calibri"/>
-          <w:b/>
-          <w:bCs/>
-        </w:rPr>
-        <w:t>sustainability perspective</w:t>
-      </w:r>
-      <w:r>
-        <w:fldChar w:fldCharType="end"/>
-      </w:r>
+      <w:hyperlink r:id="rId14" w:tooltip="https://www.kuleuven.be/english/genai/sustainable-and-responsible-use-of-genai" w:history="1">
+        <w:r>
+          <w:rPr>
+            <w:rStyle w:val="Hyperlink"/>
+            <w:rFonts w:ascii="Calibri" w:hAnsi="Calibri" w:cs="Calibri"/>
+            <w:b/>
+            <w:bCs/>
+          </w:rPr>
+          <w:t>sustainability perspective</w:t>
+        </w:r>
+      </w:hyperlink>
       <w:r>
         <w:rPr>
           <w:rFonts w:ascii="Calibri" w:hAnsi="Calibri" w:cs="Calibri"/>
@@ -751,7 +731,7 @@
         </w:rPr>
         <w:t>(</w:t>
       </w:r>
-      <w:hyperlink r:id="rId13" w:anchor="Transparantie" w:tooltip="https://www.kuleuven.be/onderwijs/student/onderwijstools/artificiele-intelligentie#Transparantie" w:history="1">
+      <w:hyperlink r:id="rId15" w:anchor="Transparantie" w:tooltip="https://www.kuleuven.be/onderwijs/student/onderwijstools/artificiele-intelligentie#Transparantie" w:history="1">
         <w:r>
           <w:rPr>
             <w:rStyle w:val="Hyperlink"/>
@@ -768,7 +748,7 @@
         </w:rPr>
         <w:t>/</w:t>
       </w:r>
-      <w:hyperlink r:id="rId14" w:anchor="Transparency" w:tooltip="https://www.kuleuven.be/english/education/student/educational-tools/generative-artificial-intelligence#Transparency" w:history="1">
+      <w:hyperlink r:id="rId16" w:anchor="Transparency" w:tooltip="https://www.kuleuven.be/english/education/student/educational-tools/generative-artificial-intelligence#Transparency" w:history="1">
         <w:r>
           <w:rPr>
             <w:rStyle w:val="Hyperlink"/>
@@ -841,7 +821,7 @@
         </w:rPr>
         <w:t>(</w:t>
       </w:r>
-      <w:hyperlink r:id="rId15" w:tooltip="https://www.kuleuven.be/genai" w:history="1">
+      <w:hyperlink r:id="rId17" w:tooltip="https://www.kuleuven.be/genai" w:history="1">
         <w:r>
           <w:rPr>
             <w:rStyle w:val="Hyperlink"/>
@@ -858,7 +838,7 @@
         </w:rPr>
         <w:t>/</w:t>
       </w:r>
-      <w:hyperlink r:id="rId16" w:tooltip="https://www.kuleuven.be/english/genai" w:history="1">
+      <w:hyperlink r:id="rId18" w:tooltip="https://www.kuleuven.be/english/genai" w:history="1">
         <w:r>
           <w:rPr>
             <w:rStyle w:val="Hyperlink"/>
@@ -1044,20 +1024,8 @@
           <w:szCs w:val="21"/>
           <w:lang w:val="en-US"/>
         </w:rPr>
-        <w:t xml:space="preserve">Gustave Esteban </w:t>
+        <w:t>Gustave Esteban Mougenot</w:t>
       </w:r>
-      <w:proofErr w:type="spellStart"/>
-      <w:r>
-        <w:rPr>
-          <w:rFonts w:ascii="Open Sans" w:eastAsia="Open Sans" w:hAnsi="Open Sans" w:cs="Open Sans"/>
-          <w:color w:val="262626" w:themeColor="text1" w:themeTint="D9"/>
-          <w:sz w:val="21"/>
-          <w:szCs w:val="21"/>
-          <w:lang w:val="en-US"/>
-        </w:rPr>
-        <w:t>Mougenot</w:t>
-      </w:r>
-      <w:proofErr w:type="spellEnd"/>
       <w:r>
         <w:tab/>
       </w:r>
@@ -1166,7 +1134,24 @@
           <w:bCs/>
           <w:lang w:val="en-US"/>
         </w:rPr>
-        <w:t>Student number: ………………………………………………..</w:t>
+        <w:t xml:space="preserve">Student number: </w:t>
+      </w:r>
+      <w:r>
+        <w:rPr>
+          <w:rFonts w:ascii="Calibri" w:hAnsi="Calibri" w:cs="Calibri"/>
+          <w:b/>
+          <w:bCs/>
+        </w:rPr>
+        <w:t>r0955044</w:t>
+      </w:r>
+      <w:r>
+        <w:rPr>
+          <w:rFonts w:ascii="Calibri" w:hAnsi="Calibri" w:cs="Calibri"/>
+          <w:b/>
+          <w:bCs/>
+          <w:lang w:val="en-US"/>
+        </w:rPr>
+        <w:t>………………………………………………..</w:t>
       </w:r>
       <w:r>
         <w:tab/>
@@ -1946,7 +1931,7 @@
               </w:rPr>
               <w:t xml:space="preserve">you have to </w:t>
             </w:r>
-            <w:hyperlink r:id="rId17" w:tooltip="https://bib.kuleuven.be/english/training-and-tutorials/citation" w:history="1">
+            <w:hyperlink r:id="rId19" w:tooltip="https://bib.kuleuven.be/english/training-and-tutorials/citation" w:history="1">
               <w:r>
                 <w:rPr>
                   <w:rStyle w:val="Hyperlink"/>
@@ -1974,7 +1959,7 @@
               </w:rPr>
               <w:t xml:space="preserve">, otherwise you are committing </w:t>
             </w:r>
-            <w:hyperlink r:id="rId18" w:tooltip="https://www.kuleuven.be/english/education/plagiarism/index" w:history="1">
+            <w:hyperlink r:id="rId20" w:tooltip="https://www.kuleuven.be/english/education/plagiarism/index" w:history="1">
               <w:r>
                 <w:rPr>
                   <w:rStyle w:val="Hyperlink"/>
@@ -2097,217 +2082,6 @@
                 <w:lang w:val="en-US" w:eastAsia="nl-BE"/>
               </w:rPr>
               <w:t xml:space="preserve">you are not allowed to include that paraphrased text without </w:t>
-            </w:r>
-            <w:hyperlink r:id="rId19" w:tooltip="https://bib.kuleuven.be/english/training-and-tutorials/citation" w:history="1">
-              <w:r>
-                <w:rPr>
-                  <w:rStyle w:val="Hyperlink"/>
-                  <w:rFonts w:ascii="Calibri" w:eastAsia="Times New Roman" w:hAnsi="Calibri" w:cs="Calibri"/>
-                  <w:b/>
-                  <w:bCs/>
-                  <w:lang w:val="en-US" w:eastAsia="nl-BE"/>
-                </w:rPr>
-                <w:t>reference</w:t>
-              </w:r>
-            </w:hyperlink>
-            <w:r>
-              <w:rPr>
-                <w:rFonts w:ascii="Calibri" w:eastAsia="Times New Roman" w:hAnsi="Calibri" w:cs="Calibri"/>
-                <w:b/>
-                <w:bCs/>
-                <w:lang w:val="en-US" w:eastAsia="nl-BE"/>
-              </w:rPr>
-              <w:t xml:space="preserve"> to the original source or author.</w:t>
-            </w:r>
-            <w:r>
-              <w:rPr>
-                <w:rFonts w:ascii="Calibri" w:eastAsia="Times New Roman" w:hAnsi="Calibri" w:cs="Calibri"/>
-                <w:lang w:val="en-US" w:eastAsia="nl-BE"/>
-              </w:rPr>
-              <w:t xml:space="preserve"> Without such reference, you would be committing </w:t>
-            </w:r>
-            <w:hyperlink r:id="rId20" w:tooltip="https://www.kuleuven.be/english/education/plagiarism/index" w:history="1">
-              <w:r>
-                <w:rPr>
-                  <w:rStyle w:val="Hyperlink"/>
-                  <w:rFonts w:ascii="Calibri" w:eastAsia="Times New Roman" w:hAnsi="Calibri" w:cs="Calibri"/>
-                  <w:lang w:val="en-US" w:eastAsia="nl-BE"/>
-                </w:rPr>
-                <w:t>plagiarism</w:t>
-              </w:r>
-            </w:hyperlink>
-            <w:r>
-              <w:rPr>
-                <w:rFonts w:ascii="Calibri" w:eastAsia="Times New Roman" w:hAnsi="Calibri" w:cs="Calibri"/>
-                <w:lang w:val="en-US" w:eastAsia="nl-BE"/>
-              </w:rPr>
-              <w:t xml:space="preserve"> and thus an irregularity.</w:t>
-            </w:r>
-          </w:p>
-          <w:p>
-            <w:pPr>
-              <w:ind w:left="360"/>
-              <w:rPr>
-                <w:rFonts w:ascii="Calibri" w:eastAsia="Times New Roman" w:hAnsi="Calibri" w:cs="Calibri"/>
-                <w:lang w:val="en-US" w:eastAsia="nl-BE"/>
-              </w:rPr>
-            </w:pPr>
-          </w:p>
-        </w:tc>
-      </w:tr>
-      <w:tr>
-        <w:tc>
-          <w:tcPr>
-            <w:tcW w:w="3539" w:type="dxa"/>
-          </w:tcPr>
-          <w:p>
-            <w:pPr>
-              <w:rPr>
-                <w:rFonts w:ascii="Calibri" w:eastAsia="Times New Roman" w:hAnsi="Calibri" w:cs="Calibri"/>
-                <w:lang w:val="en-GB" w:eastAsia="nl-BE"/>
-              </w:rPr>
-            </w:pPr>
-            <w:r>
-              <w:rPr>
-                <w:rFonts w:ascii="Calibri" w:eastAsia="Times New Roman" w:hAnsi="Calibri" w:cs="Calibri"/>
-                <w:b/>
-                <w:bCs/>
-                <w:lang w:val="en-GB" w:eastAsia="nl-BE"/>
-              </w:rPr>
-              <w:t>For translation aid to improve texts I wrote myself or to better understand text from others</w:t>
-            </w:r>
-          </w:p>
-        </w:tc>
-        <w:tc>
-          <w:tcPr>
-            <w:tcW w:w="5556" w:type="dxa"/>
-          </w:tcPr>
-          <w:p>
-            <w:pPr>
-              <w:rPr>
-                <w:rFonts w:ascii="Calibri" w:eastAsia="Times New Roman" w:hAnsi="Calibri" w:cs="Calibri"/>
-                <w:lang w:val="en-GB" w:eastAsia="nl-BE"/>
-              </w:rPr>
-            </w:pPr>
-            <w:r>
-              <w:rPr>
-                <w:rFonts w:ascii="Calibri" w:eastAsia="Times New Roman" w:hAnsi="Calibri" w:cs="Calibri"/>
-                <w:lang w:val="en-GB" w:eastAsia="nl-BE"/>
-              </w:rPr>
-              <w:t>Gemini 3.5 Flash: Fix my English in these LaTeX sentences</w:t>
-            </w:r>
-            <w:r>
-              <w:rPr>
-                <w:rFonts w:ascii="Calibri" w:eastAsia="Times New Roman" w:hAnsi="Calibri" w:cs="Calibri"/>
-                <w:lang w:val="en-GB" w:eastAsia="nl-BE"/>
-              </w:rPr>
-              <w:t xml:space="preserve"> </w:t>
-            </w:r>
-            <w:r>
-              <w:rPr>
-                <w:rFonts w:ascii="Calibri" w:eastAsia="Times New Roman" w:hAnsi="Calibri" w:cs="Calibri"/>
-                <w:lang w:val="en-GB" w:eastAsia="nl-BE"/>
-              </w:rPr>
-              <w:t>while keeping the same structure, always based on a full</w:t>
-            </w:r>
-            <w:r>
-              <w:rPr>
-                <w:rFonts w:ascii="Calibri" w:eastAsia="Times New Roman" w:hAnsi="Calibri" w:cs="Calibri"/>
-                <w:lang w:val="en-GB" w:eastAsia="nl-BE"/>
-              </w:rPr>
-              <w:t xml:space="preserve"> </w:t>
-            </w:r>
-            <w:r>
-              <w:rPr>
-                <w:rFonts w:ascii="Calibri" w:eastAsia="Times New Roman" w:hAnsi="Calibri" w:cs="Calibri"/>
-                <w:lang w:val="en-GB" w:eastAsia="nl-BE"/>
-              </w:rPr>
-              <w:t>self-written paragraph</w:t>
-            </w:r>
-            <w:r>
-              <w:rPr>
-                <w:rFonts w:ascii="Calibri" w:eastAsia="Times New Roman" w:hAnsi="Calibri" w:cs="Calibri"/>
-                <w:lang w:val="en-GB" w:eastAsia="nl-BE"/>
-              </w:rPr>
-              <w:t>.</w:t>
-            </w:r>
-          </w:p>
-        </w:tc>
-        <w:tc>
-          <w:tcPr>
-            <w:tcW w:w="6209" w:type="dxa"/>
-          </w:tcPr>
-          <w:p>
-            <w:pPr>
-              <w:rPr>
-                <w:rFonts w:ascii="Calibri" w:eastAsia="Times New Roman" w:hAnsi="Calibri" w:cs="Calibri"/>
-                <w:lang w:val="en-US" w:eastAsia="nl-BE"/>
-              </w:rPr>
-            </w:pPr>
-            <w:r>
-              <w:rPr>
-                <w:rFonts w:ascii="Calibri" w:eastAsia="Times New Roman" w:hAnsi="Calibri" w:cs="Calibri"/>
-                <w:lang w:val="en-US" w:eastAsia="nl-BE"/>
-              </w:rPr>
-              <w:t xml:space="preserve">This use is allowed except when it is prohibited by the teacher or the program of study. It is similar to using translation tools (Google translate, </w:t>
-            </w:r>
-            <w:proofErr w:type="spellStart"/>
-            <w:r>
-              <w:rPr>
-                <w:rFonts w:ascii="Calibri" w:eastAsia="Times New Roman" w:hAnsi="Calibri" w:cs="Calibri"/>
-                <w:lang w:val="en-US" w:eastAsia="nl-BE"/>
-              </w:rPr>
-              <w:t>DeepL</w:t>
-            </w:r>
-            <w:proofErr w:type="spellEnd"/>
-            <w:r>
-              <w:rPr>
-                <w:rFonts w:ascii="Calibri" w:eastAsia="Times New Roman" w:hAnsi="Calibri" w:cs="Calibri"/>
-                <w:lang w:val="en-US" w:eastAsia="nl-BE"/>
-              </w:rPr>
-              <w:t xml:space="preserve">, …). In general, you do not have to refer to such kind of GenAI use in the text. </w:t>
-            </w:r>
-          </w:p>
-          <w:p>
-            <w:pPr>
-              <w:rPr>
-                <w:rFonts w:ascii="Calibri" w:eastAsia="Times New Roman" w:hAnsi="Calibri" w:cs="Calibri"/>
-                <w:b/>
-                <w:bCs/>
-                <w:lang w:val="en-US" w:eastAsia="nl-BE"/>
-              </w:rPr>
-            </w:pPr>
-            <w:r>
-              <w:rPr>
-                <w:rFonts w:ascii="Calibri" w:eastAsia="Times New Roman" w:hAnsi="Calibri" w:cs="Calibri"/>
-                <w:b/>
-                <w:bCs/>
-                <w:lang w:val="en-US" w:eastAsia="nl-BE"/>
-              </w:rPr>
-              <w:lastRenderedPageBreak/>
-              <w:t xml:space="preserve">However, be careful: </w:t>
-            </w:r>
-          </w:p>
-          <w:p>
-            <w:pPr>
-              <w:pStyle w:val="ListParagraph"/>
-              <w:numPr>
-                <w:ilvl w:val="0"/>
-                <w:numId w:val="10"/>
-              </w:numPr>
-              <w:rPr>
-                <w:rFonts w:ascii="Calibri" w:eastAsia="Times New Roman" w:hAnsi="Calibri" w:cs="Calibri"/>
-                <w:lang w:val="en-US" w:eastAsia="nl-BE"/>
-              </w:rPr>
-            </w:pPr>
-            <w:r>
-              <w:rPr>
-                <w:rFonts w:ascii="Calibri" w:eastAsia="Times New Roman" w:hAnsi="Calibri" w:cs="Calibri"/>
-                <w:b/>
-                <w:bCs/>
-                <w:lang w:val="en-US" w:eastAsia="nl-BE"/>
-              </w:rPr>
-              <w:t xml:space="preserve">You are not allowed to include that translated text without </w:t>
             </w:r>
             <w:hyperlink r:id="rId21" w:tooltip="https://bib.kuleuven.be/english/training-and-tutorials/citation" w:history="1">
               <w:r>
@@ -2357,6 +2131,201 @@
           </w:p>
           <w:p>
             <w:pPr>
+              <w:ind w:left="360"/>
+              <w:rPr>
+                <w:rFonts w:ascii="Calibri" w:eastAsia="Times New Roman" w:hAnsi="Calibri" w:cs="Calibri"/>
+                <w:lang w:val="en-US" w:eastAsia="nl-BE"/>
+              </w:rPr>
+            </w:pPr>
+          </w:p>
+        </w:tc>
+      </w:tr>
+      <w:tr>
+        <w:tc>
+          <w:tcPr>
+            <w:tcW w:w="3539" w:type="dxa"/>
+          </w:tcPr>
+          <w:p>
+            <w:pPr>
+              <w:rPr>
+                <w:rFonts w:ascii="Calibri" w:eastAsia="Times New Roman" w:hAnsi="Calibri" w:cs="Calibri"/>
+                <w:lang w:val="en-GB" w:eastAsia="nl-BE"/>
+              </w:rPr>
+            </w:pPr>
+            <w:r>
+              <w:rPr>
+                <w:rFonts w:ascii="Calibri" w:eastAsia="Times New Roman" w:hAnsi="Calibri" w:cs="Calibri"/>
+                <w:b/>
+                <w:bCs/>
+                <w:lang w:val="en-GB" w:eastAsia="nl-BE"/>
+              </w:rPr>
+              <w:t>For translation aid to improve texts I wrote myself or to better understand text from others</w:t>
+            </w:r>
+          </w:p>
+        </w:tc>
+        <w:tc>
+          <w:tcPr>
+            <w:tcW w:w="5556" w:type="dxa"/>
+          </w:tcPr>
+          <w:p>
+            <w:pPr>
+              <w:rPr>
+                <w:rFonts w:ascii="Calibri" w:eastAsia="Times New Roman" w:hAnsi="Calibri" w:cs="Calibri"/>
+                <w:lang w:val="en-GB" w:eastAsia="nl-BE"/>
+              </w:rPr>
+            </w:pPr>
+            <w:r>
+              <w:rPr>
+                <w:rFonts w:ascii="Calibri" w:eastAsia="Times New Roman" w:hAnsi="Calibri" w:cs="Calibri"/>
+                <w:lang w:val="en-GB" w:eastAsia="nl-BE"/>
+              </w:rPr>
+              <w:t>Gemini 3.5 Flash: Fix my English in these LaTeX sentences</w:t>
+            </w:r>
+            <w:r>
+              <w:rPr>
+                <w:rFonts w:ascii="Calibri" w:eastAsia="Times New Roman" w:hAnsi="Calibri" w:cs="Calibri"/>
+                <w:lang w:val="en-GB" w:eastAsia="nl-BE"/>
+              </w:rPr>
+              <w:t xml:space="preserve"> </w:t>
+            </w:r>
+            <w:r>
+              <w:rPr>
+                <w:rFonts w:ascii="Calibri" w:eastAsia="Times New Roman" w:hAnsi="Calibri" w:cs="Calibri"/>
+                <w:lang w:val="en-GB" w:eastAsia="nl-BE"/>
+              </w:rPr>
+              <w:t>while keeping the same structure, always based on a full</w:t>
+            </w:r>
+            <w:r>
+              <w:rPr>
+                <w:rFonts w:ascii="Calibri" w:eastAsia="Times New Roman" w:hAnsi="Calibri" w:cs="Calibri"/>
+                <w:lang w:val="en-GB" w:eastAsia="nl-BE"/>
+              </w:rPr>
+              <w:t xml:space="preserve"> </w:t>
+            </w:r>
+            <w:r>
+              <w:rPr>
+                <w:rFonts w:ascii="Calibri" w:eastAsia="Times New Roman" w:hAnsi="Calibri" w:cs="Calibri"/>
+                <w:lang w:val="en-GB" w:eastAsia="nl-BE"/>
+              </w:rPr>
+              <w:t>self-written paragraph</w:t>
+            </w:r>
+            <w:r>
+              <w:rPr>
+                <w:rFonts w:ascii="Calibri" w:eastAsia="Times New Roman" w:hAnsi="Calibri" w:cs="Calibri"/>
+                <w:lang w:val="en-GB" w:eastAsia="nl-BE"/>
+              </w:rPr>
+              <w:t>.</w:t>
+            </w:r>
+          </w:p>
+        </w:tc>
+        <w:tc>
+          <w:tcPr>
+            <w:tcW w:w="6209" w:type="dxa"/>
+          </w:tcPr>
+          <w:p>
+            <w:pPr>
+              <w:rPr>
+                <w:rFonts w:ascii="Calibri" w:eastAsia="Times New Roman" w:hAnsi="Calibri" w:cs="Calibri"/>
+                <w:lang w:val="en-US" w:eastAsia="nl-BE"/>
+              </w:rPr>
+            </w:pPr>
+            <w:r>
+              <w:rPr>
+                <w:rFonts w:ascii="Calibri" w:eastAsia="Times New Roman" w:hAnsi="Calibri" w:cs="Calibri"/>
+                <w:lang w:val="en-US" w:eastAsia="nl-BE"/>
+              </w:rPr>
+              <w:t xml:space="preserve">This use is allowed except when it is prohibited by the teacher or the program of study. It is similar to using translation tools (Google translate, DeepL, …). In general, you do not have to refer to such kind of GenAI use in the text. </w:t>
+            </w:r>
+          </w:p>
+          <w:p>
+            <w:pPr>
+              <w:rPr>
+                <w:rFonts w:ascii="Calibri" w:eastAsia="Times New Roman" w:hAnsi="Calibri" w:cs="Calibri"/>
+                <w:b/>
+                <w:bCs/>
+                <w:lang w:val="en-US" w:eastAsia="nl-BE"/>
+              </w:rPr>
+            </w:pPr>
+            <w:r>
+              <w:rPr>
+                <w:rFonts w:ascii="Calibri" w:eastAsia="Times New Roman" w:hAnsi="Calibri" w:cs="Calibri"/>
+                <w:b/>
+                <w:bCs/>
+                <w:lang w:val="en-US" w:eastAsia="nl-BE"/>
+              </w:rPr>
+              <w:lastRenderedPageBreak/>
+              <w:t xml:space="preserve">However, be careful: </w:t>
+            </w:r>
+          </w:p>
+          <w:p>
+            <w:pPr>
+              <w:pStyle w:val="ListParagraph"/>
+              <w:numPr>
+                <w:ilvl w:val="0"/>
+                <w:numId w:val="10"/>
+              </w:numPr>
+              <w:rPr>
+                <w:rFonts w:ascii="Calibri" w:eastAsia="Times New Roman" w:hAnsi="Calibri" w:cs="Calibri"/>
+                <w:lang w:val="en-US" w:eastAsia="nl-BE"/>
+              </w:rPr>
+            </w:pPr>
+            <w:r>
+              <w:rPr>
+                <w:rFonts w:ascii="Calibri" w:eastAsia="Times New Roman" w:hAnsi="Calibri" w:cs="Calibri"/>
+                <w:b/>
+                <w:bCs/>
+                <w:lang w:val="en-US" w:eastAsia="nl-BE"/>
+              </w:rPr>
+              <w:t xml:space="preserve">You are not allowed to include that translated text without </w:t>
+            </w:r>
+            <w:hyperlink r:id="rId23" w:tooltip="https://bib.kuleuven.be/english/training-and-tutorials/citation" w:history="1">
+              <w:r>
+                <w:rPr>
+                  <w:rStyle w:val="Hyperlink"/>
+                  <w:rFonts w:ascii="Calibri" w:eastAsia="Times New Roman" w:hAnsi="Calibri" w:cs="Calibri"/>
+                  <w:b/>
+                  <w:bCs/>
+                  <w:lang w:val="en-US" w:eastAsia="nl-BE"/>
+                </w:rPr>
+                <w:t>reference</w:t>
+              </w:r>
+            </w:hyperlink>
+            <w:r>
+              <w:rPr>
+                <w:rFonts w:ascii="Calibri" w:eastAsia="Times New Roman" w:hAnsi="Calibri" w:cs="Calibri"/>
+                <w:b/>
+                <w:bCs/>
+                <w:lang w:val="en-US" w:eastAsia="nl-BE"/>
+              </w:rPr>
+              <w:t xml:space="preserve"> to the original source or author.</w:t>
+            </w:r>
+            <w:r>
+              <w:rPr>
+                <w:rFonts w:ascii="Calibri" w:eastAsia="Times New Roman" w:hAnsi="Calibri" w:cs="Calibri"/>
+                <w:lang w:val="en-US" w:eastAsia="nl-BE"/>
+              </w:rPr>
+              <w:t xml:space="preserve"> Without such reference, you would be committing </w:t>
+            </w:r>
+            <w:hyperlink r:id="rId24" w:tooltip="https://www.kuleuven.be/english/education/plagiarism/index" w:history="1">
+              <w:r>
+                <w:rPr>
+                  <w:rStyle w:val="Hyperlink"/>
+                  <w:rFonts w:ascii="Calibri" w:eastAsia="Times New Roman" w:hAnsi="Calibri" w:cs="Calibri"/>
+                  <w:lang w:val="en-US" w:eastAsia="nl-BE"/>
+                </w:rPr>
+                <w:t>plagiarism</w:t>
+              </w:r>
+            </w:hyperlink>
+            <w:r>
+              <w:rPr>
+                <w:rFonts w:ascii="Calibri" w:eastAsia="Times New Roman" w:hAnsi="Calibri" w:cs="Calibri"/>
+                <w:lang w:val="en-US" w:eastAsia="nl-BE"/>
+              </w:rPr>
+              <w:t xml:space="preserve"> and thus an irregularity.</w:t>
+            </w:r>
+          </w:p>
+          <w:p>
+            <w:pPr>
               <w:rPr>
                 <w:rFonts w:ascii="Calibri" w:eastAsia="Times New Roman" w:hAnsi="Calibri" w:cs="Calibri"/>
                 <w:lang w:val="en-US" w:eastAsia="nl-BE"/>
@@ -2449,7 +2418,6 @@
               </w:rPr>
               <w:t>Y</w:t>
             </w:r>
-            <w:proofErr w:type="spellStart"/>
             <w:r>
               <w:rPr>
                 <w:rFonts w:ascii="Calibri" w:eastAsia="Times New Roman" w:hAnsi="Calibri" w:cs="Calibri"/>
@@ -2457,203 +2425,7 @@
                 <w:bCs/>
                 <w:lang w:val="en-GB" w:eastAsia="nl-BE"/>
               </w:rPr>
-              <w:t>ou</w:t>
-            </w:r>
-            <w:proofErr w:type="spellEnd"/>
-            <w:r>
-              <w:rPr>
-                <w:rFonts w:ascii="Calibri" w:eastAsia="Times New Roman" w:hAnsi="Calibri" w:cs="Calibri"/>
-                <w:b/>
-                <w:bCs/>
-                <w:lang w:val="en-GB" w:eastAsia="nl-BE"/>
-              </w:rPr>
-              <w:t xml:space="preserve"> only have to </w:t>
-            </w:r>
-            <w:hyperlink r:id="rId23" w:tooltip="https://bib.kuleuven.be/english/training-and-tutorials/citation" w:history="1">
-              <w:r>
-                <w:rPr>
-                  <w:rStyle w:val="Hyperlink"/>
-                  <w:rFonts w:ascii="Calibri" w:eastAsia="Times New Roman" w:hAnsi="Calibri" w:cs="Calibri"/>
-                  <w:b/>
-                  <w:bCs/>
-                  <w:lang w:val="en-GB" w:eastAsia="nl-BE"/>
-                </w:rPr>
-                <w:t>refer</w:t>
-              </w:r>
-            </w:hyperlink>
-            <w:r>
-              <w:rPr>
-                <w:rFonts w:ascii="Calibri" w:eastAsia="Times New Roman" w:hAnsi="Calibri" w:cs="Calibri"/>
-                <w:b/>
-                <w:bCs/>
-                <w:lang w:val="en-GB" w:eastAsia="nl-BE"/>
-              </w:rPr>
-              <w:t xml:space="preserve"> to the existing research and references you have checked and used</w:t>
-            </w:r>
-            <w:r>
-              <w:rPr>
-                <w:rFonts w:ascii="Calibri" w:eastAsia="Times New Roman" w:hAnsi="Calibri" w:cs="Calibri"/>
-                <w:lang w:val="en-GB" w:eastAsia="nl-BE"/>
-              </w:rPr>
-              <w:t xml:space="preserve"> (without such references you would </w:t>
-            </w:r>
-            <w:r>
-              <w:rPr>
-                <w:rFonts w:ascii="Calibri" w:eastAsia="Times New Roman" w:hAnsi="Calibri" w:cs="Calibri"/>
-                <w:lang w:val="en-US" w:eastAsia="nl-BE"/>
-              </w:rPr>
-              <w:t xml:space="preserve">be committing </w:t>
-            </w:r>
-            <w:hyperlink r:id="rId24" w:tooltip="https://www.kuleuven.be/english/education/plagiarism/index" w:history="1">
-              <w:r>
-                <w:rPr>
-                  <w:rStyle w:val="Hyperlink"/>
-                  <w:rFonts w:ascii="Calibri" w:eastAsia="Times New Roman" w:hAnsi="Calibri" w:cs="Calibri"/>
-                  <w:lang w:val="en-US" w:eastAsia="nl-BE"/>
-                </w:rPr>
-                <w:t>plagiarism</w:t>
-              </w:r>
-            </w:hyperlink>
-            <w:r>
-              <w:rPr>
-                <w:rFonts w:ascii="Calibri" w:eastAsia="Times New Roman" w:hAnsi="Calibri" w:cs="Calibri"/>
-                <w:lang w:val="en-US" w:eastAsia="nl-BE"/>
-              </w:rPr>
-              <w:t xml:space="preserve"> and thus committing an irregularity)</w:t>
-            </w:r>
-            <w:r>
-              <w:rPr>
-                <w:rFonts w:ascii="Calibri" w:eastAsia="Times New Roman" w:hAnsi="Calibri" w:cs="Calibri"/>
-                <w:lang w:val="en-GB" w:eastAsia="nl-BE"/>
-              </w:rPr>
-              <w:t>.</w:t>
-            </w:r>
-          </w:p>
-          <w:p>
-            <w:pPr>
-              <w:rPr>
-                <w:rFonts w:ascii="Calibri" w:eastAsia="Times New Roman" w:hAnsi="Calibri" w:cs="Calibri"/>
-                <w:b/>
-                <w:bCs/>
-                <w:lang w:val="en-US" w:eastAsia="nl-BE"/>
-              </w:rPr>
-            </w:pPr>
-            <w:r>
-              <w:rPr>
-                <w:rFonts w:ascii="Calibri" w:eastAsia="Times New Roman" w:hAnsi="Calibri" w:cs="Calibri"/>
-                <w:b/>
-                <w:bCs/>
-                <w:lang w:val="en-US" w:eastAsia="nl-BE"/>
-              </w:rPr>
-              <w:t>However, be careful:</w:t>
-            </w:r>
-          </w:p>
-          <w:p>
-            <w:pPr>
-              <w:pStyle w:val="ListParagraph"/>
-              <w:numPr>
-                <w:ilvl w:val="0"/>
-                <w:numId w:val="10"/>
-              </w:numPr>
-              <w:rPr>
-                <w:rFonts w:ascii="Times New Roman" w:eastAsia="Times New Roman" w:hAnsi="Times New Roman" w:cs="Times New Roman"/>
-                <w:sz w:val="24"/>
-                <w:szCs w:val="24"/>
-                <w:lang w:val="en-GB" w:eastAsia="nl-BE"/>
-              </w:rPr>
-            </w:pPr>
-            <w:r>
-              <w:rPr>
-                <w:rFonts w:ascii="Calibri" w:eastAsia="Times New Roman" w:hAnsi="Calibri" w:cs="Calibri"/>
-                <w:lang w:val="en-US" w:eastAsia="nl-BE"/>
-              </w:rPr>
-              <w:t xml:space="preserve">Be aware that the output of the GenAI tool cannot be guaranteed as a 100% reliable source of information. The output may not be entirely correct and/or be limited due to the databases it uses. Moreover, knowledge evolves and may change over time; therefore, the database of the GenAI tool may not be up to date. Therefore, </w:t>
-            </w:r>
-            <w:r>
-              <w:rPr>
-                <w:rFonts w:ascii="Calibri" w:eastAsia="Times New Roman" w:hAnsi="Calibri" w:cs="Calibri"/>
-                <w:b/>
-                <w:bCs/>
-                <w:lang w:val="en-GB" w:eastAsia="nl-BE"/>
-              </w:rPr>
-              <w:t>verify the information and do not just copy-paste it</w:t>
-            </w:r>
-            <w:r>
-              <w:rPr>
-                <w:rFonts w:ascii="Calibri" w:eastAsia="Times New Roman" w:hAnsi="Calibri" w:cs="Calibri"/>
-                <w:lang w:val="en-GB" w:eastAsia="nl-BE"/>
-              </w:rPr>
-              <w:t xml:space="preserve"> as you should understand and critically process everything you are writing. </w:t>
-            </w:r>
-          </w:p>
-        </w:tc>
-      </w:tr>
-      <w:tr>
-        <w:tc>
-          <w:tcPr>
-            <w:tcW w:w="3539" w:type="dxa"/>
-          </w:tcPr>
-          <w:p>
-            <w:pPr>
-              <w:rPr>
-                <w:rFonts w:ascii="Calibri" w:eastAsia="Times New Roman" w:hAnsi="Calibri" w:cs="Calibri"/>
-                <w:b/>
-                <w:bCs/>
-                <w:lang w:val="en-GB" w:eastAsia="nl-BE"/>
-              </w:rPr>
-            </w:pPr>
-            <w:r>
-              <w:rPr>
-                <w:rFonts w:ascii="Calibri" w:eastAsia="Times New Roman" w:hAnsi="Calibri" w:cs="Calibri"/>
-                <w:b/>
-                <w:bCs/>
-                <w:lang w:val="en-GB" w:eastAsia="nl-BE"/>
-              </w:rPr>
-              <w:t>For literature search</w:t>
-            </w:r>
-          </w:p>
-        </w:tc>
-        <w:tc>
-          <w:tcPr>
-            <w:tcW w:w="5556" w:type="dxa"/>
-          </w:tcPr>
-          <w:p>
-            <w:pPr>
-              <w:rPr>
-                <w:rFonts w:ascii="Calibri" w:eastAsia="Times New Roman" w:hAnsi="Calibri" w:cs="Calibri"/>
-                <w:lang w:val="en-GB" w:eastAsia="nl-BE"/>
-              </w:rPr>
-            </w:pPr>
-          </w:p>
-        </w:tc>
-        <w:tc>
-          <w:tcPr>
-            <w:tcW w:w="6209" w:type="dxa"/>
-          </w:tcPr>
-          <w:p>
-            <w:pPr>
-              <w:rPr>
-                <w:rFonts w:ascii="Times New Roman" w:eastAsia="Times New Roman" w:hAnsi="Times New Roman" w:cs="Times New Roman"/>
-                <w:sz w:val="24"/>
-                <w:szCs w:val="24"/>
-                <w:lang w:val="en-GB" w:eastAsia="nl-BE"/>
-              </w:rPr>
-            </w:pPr>
-            <w:r>
-              <w:rPr>
-                <w:rFonts w:ascii="Calibri" w:eastAsia="Times New Roman" w:hAnsi="Calibri" w:cs="Calibri"/>
-                <w:lang w:val="en-GB" w:eastAsia="nl-BE"/>
-              </w:rPr>
-              <w:t xml:space="preserve">This use is comparable to e.g. a Google Scholar search. You do not have to refer to such kind of GenAI use; </w:t>
-            </w:r>
-            <w:r>
-              <w:rPr>
-                <w:rFonts w:ascii="Calibri" w:eastAsia="Times New Roman" w:hAnsi="Calibri" w:cs="Calibri"/>
-                <w:b/>
-                <w:bCs/>
-                <w:lang w:val="en-GB" w:eastAsia="nl-BE"/>
-              </w:rPr>
-              <w:t xml:space="preserve">you only have to </w:t>
+              <w:t xml:space="preserve">ou only have to </w:t>
             </w:r>
             <w:hyperlink r:id="rId25" w:tooltip="https://bib.kuleuven.be/english/training-and-tutorials/citation" w:history="1">
               <w:r>
@@ -2674,7 +2446,7 @@
                 <w:bCs/>
                 <w:lang w:val="en-GB" w:eastAsia="nl-BE"/>
               </w:rPr>
-              <w:t xml:space="preserve"> to the literature references you have checked and used</w:t>
+              <w:t xml:space="preserve"> to the existing research and references you have checked and used</w:t>
             </w:r>
             <w:r>
               <w:rPr>
@@ -2712,26 +2484,24 @@
                 <w:rFonts w:ascii="Calibri" w:eastAsia="Times New Roman" w:hAnsi="Calibri" w:cs="Calibri"/>
                 <w:lang w:val="en-GB" w:eastAsia="nl-BE"/>
               </w:rPr>
-              <w:t>..</w:t>
+              <w:t>.</w:t>
             </w:r>
           </w:p>
           <w:p>
             <w:pPr>
               <w:rPr>
-                <w:rFonts w:ascii="Times New Roman" w:eastAsia="Times New Roman" w:hAnsi="Times New Roman" w:cs="Times New Roman"/>
-                <w:b/>
-                <w:bCs/>
-                <w:sz w:val="24"/>
-                <w:szCs w:val="24"/>
-                <w:lang w:val="en-GB" w:eastAsia="nl-BE"/>
-              </w:rPr>
-            </w:pPr>
-            <w:r>
-              <w:rPr>
                 <w:rFonts w:ascii="Calibri" w:eastAsia="Times New Roman" w:hAnsi="Calibri" w:cs="Calibri"/>
                 <w:b/>
                 <w:bCs/>
-                <w:lang w:val="en-GB" w:eastAsia="nl-BE"/>
+                <w:lang w:val="en-US" w:eastAsia="nl-BE"/>
+              </w:rPr>
+            </w:pPr>
+            <w:r>
+              <w:rPr>
+                <w:rFonts w:ascii="Calibri" w:eastAsia="Times New Roman" w:hAnsi="Calibri" w:cs="Calibri"/>
+                <w:b/>
+                <w:bCs/>
+                <w:lang w:val="en-US" w:eastAsia="nl-BE"/>
               </w:rPr>
               <w:t>However, be careful:</w:t>
             </w:r>
@@ -2753,6 +2523,194 @@
             <w:r>
               <w:rPr>
                 <w:rFonts w:ascii="Calibri" w:eastAsia="Times New Roman" w:hAnsi="Calibri" w:cs="Calibri"/>
+                <w:lang w:val="en-US" w:eastAsia="nl-BE"/>
+              </w:rPr>
+              <w:t xml:space="preserve">Be aware that the output of the GenAI tool cannot be guaranteed as a 100% reliable source of information. The output may not be entirely correct and/or be limited due to the databases it uses. Moreover, knowledge evolves and may change over time; therefore, the database of the GenAI tool may not be up to date. Therefore, </w:t>
+            </w:r>
+            <w:r>
+              <w:rPr>
+                <w:rFonts w:ascii="Calibri" w:eastAsia="Times New Roman" w:hAnsi="Calibri" w:cs="Calibri"/>
+                <w:b/>
+                <w:bCs/>
+                <w:lang w:val="en-GB" w:eastAsia="nl-BE"/>
+              </w:rPr>
+              <w:t>verify the information and do not just copy-paste it</w:t>
+            </w:r>
+            <w:r>
+              <w:rPr>
+                <w:rFonts w:ascii="Calibri" w:eastAsia="Times New Roman" w:hAnsi="Calibri" w:cs="Calibri"/>
+                <w:lang w:val="en-GB" w:eastAsia="nl-BE"/>
+              </w:rPr>
+              <w:t xml:space="preserve"> as you should understand and critically process everything you are writing. </w:t>
+            </w:r>
+          </w:p>
+        </w:tc>
+      </w:tr>
+      <w:tr>
+        <w:tc>
+          <w:tcPr>
+            <w:tcW w:w="3539" w:type="dxa"/>
+          </w:tcPr>
+          <w:p>
+            <w:pPr>
+              <w:rPr>
+                <w:rFonts w:ascii="Calibri" w:eastAsia="Times New Roman" w:hAnsi="Calibri" w:cs="Calibri"/>
+                <w:b/>
+                <w:bCs/>
+                <w:lang w:val="en-GB" w:eastAsia="nl-BE"/>
+              </w:rPr>
+            </w:pPr>
+            <w:r>
+              <w:rPr>
+                <w:rFonts w:ascii="Calibri" w:eastAsia="Times New Roman" w:hAnsi="Calibri" w:cs="Calibri"/>
+                <w:b/>
+                <w:bCs/>
+                <w:lang w:val="en-GB" w:eastAsia="nl-BE"/>
+              </w:rPr>
+              <w:t>For literature search</w:t>
+            </w:r>
+          </w:p>
+        </w:tc>
+        <w:tc>
+          <w:tcPr>
+            <w:tcW w:w="5556" w:type="dxa"/>
+          </w:tcPr>
+          <w:p>
+            <w:pPr>
+              <w:rPr>
+                <w:rFonts w:ascii="Calibri" w:eastAsia="Times New Roman" w:hAnsi="Calibri" w:cs="Calibri"/>
+                <w:lang w:val="en-GB" w:eastAsia="nl-BE"/>
+              </w:rPr>
+            </w:pPr>
+          </w:p>
+        </w:tc>
+        <w:tc>
+          <w:tcPr>
+            <w:tcW w:w="6209" w:type="dxa"/>
+          </w:tcPr>
+          <w:p>
+            <w:pPr>
+              <w:rPr>
+                <w:rFonts w:ascii="Times New Roman" w:eastAsia="Times New Roman" w:hAnsi="Times New Roman" w:cs="Times New Roman"/>
+                <w:sz w:val="24"/>
+                <w:szCs w:val="24"/>
+                <w:lang w:val="en-GB" w:eastAsia="nl-BE"/>
+              </w:rPr>
+            </w:pPr>
+            <w:r>
+              <w:rPr>
+                <w:rFonts w:ascii="Calibri" w:eastAsia="Times New Roman" w:hAnsi="Calibri" w:cs="Calibri"/>
+                <w:lang w:val="en-GB" w:eastAsia="nl-BE"/>
+              </w:rPr>
+              <w:t xml:space="preserve">This use is comparable to e.g. a Google Scholar search. You do not have to refer to such kind of GenAI use; </w:t>
+            </w:r>
+            <w:r>
+              <w:rPr>
+                <w:rFonts w:ascii="Calibri" w:eastAsia="Times New Roman" w:hAnsi="Calibri" w:cs="Calibri"/>
+                <w:b/>
+                <w:bCs/>
+                <w:lang w:val="en-GB" w:eastAsia="nl-BE"/>
+              </w:rPr>
+              <w:t xml:space="preserve">you only have to </w:t>
+            </w:r>
+            <w:hyperlink r:id="rId27" w:tooltip="https://bib.kuleuven.be/english/training-and-tutorials/citation" w:history="1">
+              <w:r>
+                <w:rPr>
+                  <w:rStyle w:val="Hyperlink"/>
+                  <w:rFonts w:ascii="Calibri" w:eastAsia="Times New Roman" w:hAnsi="Calibri" w:cs="Calibri"/>
+                  <w:b/>
+                  <w:bCs/>
+                  <w:lang w:val="en-GB" w:eastAsia="nl-BE"/>
+                </w:rPr>
+                <w:t>refer</w:t>
+              </w:r>
+            </w:hyperlink>
+            <w:r>
+              <w:rPr>
+                <w:rFonts w:ascii="Calibri" w:eastAsia="Times New Roman" w:hAnsi="Calibri" w:cs="Calibri"/>
+                <w:b/>
+                <w:bCs/>
+                <w:lang w:val="en-GB" w:eastAsia="nl-BE"/>
+              </w:rPr>
+              <w:t xml:space="preserve"> to the literature references you have checked and used</w:t>
+            </w:r>
+            <w:r>
+              <w:rPr>
+                <w:rFonts w:ascii="Calibri" w:eastAsia="Times New Roman" w:hAnsi="Calibri" w:cs="Calibri"/>
+                <w:lang w:val="en-GB" w:eastAsia="nl-BE"/>
+              </w:rPr>
+              <w:t xml:space="preserve"> (without such references you would </w:t>
+            </w:r>
+            <w:r>
+              <w:rPr>
+                <w:rFonts w:ascii="Calibri" w:eastAsia="Times New Roman" w:hAnsi="Calibri" w:cs="Calibri"/>
+                <w:lang w:val="en-US" w:eastAsia="nl-BE"/>
+              </w:rPr>
+              <w:t xml:space="preserve">be committing </w:t>
+            </w:r>
+            <w:hyperlink r:id="rId28" w:tooltip="https://www.kuleuven.be/english/education/plagiarism/index" w:history="1">
+              <w:r>
+                <w:rPr>
+                  <w:rStyle w:val="Hyperlink"/>
+                  <w:rFonts w:ascii="Calibri" w:eastAsia="Times New Roman" w:hAnsi="Calibri" w:cs="Calibri"/>
+                  <w:lang w:val="en-US" w:eastAsia="nl-BE"/>
+                </w:rPr>
+                <w:t>plagiarism</w:t>
+              </w:r>
+            </w:hyperlink>
+            <w:r>
+              <w:rPr>
+                <w:rFonts w:ascii="Calibri" w:eastAsia="Times New Roman" w:hAnsi="Calibri" w:cs="Calibri"/>
+                <w:lang w:val="en-US" w:eastAsia="nl-BE"/>
+              </w:rPr>
+              <w:t xml:space="preserve"> and thus committing an irregularity)</w:t>
+            </w:r>
+            <w:r>
+              <w:rPr>
+                <w:rFonts w:ascii="Calibri" w:eastAsia="Times New Roman" w:hAnsi="Calibri" w:cs="Calibri"/>
+                <w:lang w:val="en-GB" w:eastAsia="nl-BE"/>
+              </w:rPr>
+              <w:t>..</w:t>
+            </w:r>
+          </w:p>
+          <w:p>
+            <w:pPr>
+              <w:rPr>
+                <w:rFonts w:ascii="Times New Roman" w:eastAsia="Times New Roman" w:hAnsi="Times New Roman" w:cs="Times New Roman"/>
+                <w:b/>
+                <w:bCs/>
+                <w:sz w:val="24"/>
+                <w:szCs w:val="24"/>
+                <w:lang w:val="en-GB" w:eastAsia="nl-BE"/>
+              </w:rPr>
+            </w:pPr>
+            <w:r>
+              <w:rPr>
+                <w:rFonts w:ascii="Calibri" w:eastAsia="Times New Roman" w:hAnsi="Calibri" w:cs="Calibri"/>
+                <w:b/>
+                <w:bCs/>
+                <w:lang w:val="en-GB" w:eastAsia="nl-BE"/>
+              </w:rPr>
+              <w:t>However, be careful:</w:t>
+            </w:r>
+          </w:p>
+          <w:p>
+            <w:pPr>
+              <w:pStyle w:val="ListParagraph"/>
+              <w:numPr>
+                <w:ilvl w:val="0"/>
+                <w:numId w:val="10"/>
+              </w:numPr>
+              <w:rPr>
+                <w:rFonts w:ascii="Times New Roman" w:eastAsia="Times New Roman" w:hAnsi="Times New Roman" w:cs="Times New Roman"/>
+                <w:sz w:val="24"/>
+                <w:szCs w:val="24"/>
+                <w:lang w:val="en-GB" w:eastAsia="nl-BE"/>
+              </w:rPr>
+            </w:pPr>
+            <w:r>
+              <w:rPr>
+                <w:rFonts w:ascii="Calibri" w:eastAsia="Times New Roman" w:hAnsi="Calibri" w:cs="Calibri"/>
                 <w:lang w:val="en-GB" w:eastAsia="nl-BE"/>
               </w:rPr>
               <w:t xml:space="preserve">Be aware that the search output is restricted to the database the GenAI tool is built on. After this initial search, look for scientific sources and conduct your own analysis of the source documents. </w:t>
@@ -2814,7 +2772,7 @@
               </w:rPr>
               <w:t xml:space="preserve">output </w:t>
             </w:r>
-            <w:hyperlink r:id="rId27" w:tooltip="https://www.kuleuven.be/english/education/leuvenlearninglab/support/toolguide/guidelines-for-safe-use-of-genai-tools" w:history="1">
+            <w:hyperlink r:id="rId29" w:tooltip="https://www.kuleuven.be/english/education/leuvenlearninglab/support/toolguide/guidelines-for-safe-use-of-genai-tools" w:history="1">
               <w:r>
                 <w:rPr>
                   <w:rStyle w:val="Hyperlink"/>
@@ -2878,23 +2836,7 @@
                 <w:rFonts w:ascii="Calibri" w:eastAsia="Times New Roman" w:hAnsi="Calibri" w:cs="Calibri"/>
                 <w:lang w:val="en-GB" w:eastAsia="nl-BE"/>
               </w:rPr>
-              <w:t xml:space="preserve">Claude Sonnet 4.6: For generating small Java pieces of code. To efficiently be aware of what’s possible with </w:t>
-            </w:r>
-            <w:proofErr w:type="spellStart"/>
-            <w:r>
-              <w:rPr>
-                <w:rFonts w:ascii="Calibri" w:eastAsia="Times New Roman" w:hAnsi="Calibri" w:cs="Calibri"/>
-                <w:lang w:val="en-GB" w:eastAsia="nl-BE"/>
-              </w:rPr>
-              <w:t>AnyLogic</w:t>
-            </w:r>
-            <w:proofErr w:type="spellEnd"/>
-            <w:r>
-              <w:rPr>
-                <w:rFonts w:ascii="Calibri" w:eastAsia="Times New Roman" w:hAnsi="Calibri" w:cs="Calibri"/>
-                <w:lang w:val="en-GB" w:eastAsia="nl-BE"/>
-              </w:rPr>
-              <w:t xml:space="preserve"> and as a helper for debugging.</w:t>
+              <w:t>Claude Sonnet 4.6: For generating small Java pieces of code. To efficiently be aware of what’s possible with AnyLogic and as a helper for debugging.</w:t>
             </w:r>
           </w:p>
         </w:tc>
@@ -2932,29 +2874,13 @@
               </w:rPr>
               <w:t xml:space="preserve">the instructions on the </w:t>
             </w:r>
-            <w:hyperlink r:id="rId28" w:anchor="Transparency" w:tooltip="https://www.kuleuven.be/english/education/student/educational-tools/generative-artificial-intelligence#Transparency" w:history="1">
+            <w:hyperlink r:id="rId30" w:anchor="Transparency" w:tooltip="https://www.kuleuven.be/english/education/student/educational-tools/generative-artificial-intelligence#Transparency" w:history="1">
               <w:r>
                 <w:rPr>
                   <w:rStyle w:val="Hyperlink"/>
                   <w:lang w:val="en-US"/>
                 </w:rPr>
-                <w:t xml:space="preserve">page on being </w:t>
-              </w:r>
-              <w:proofErr w:type="spellStart"/>
-              <w:r>
-                <w:rPr>
-                  <w:rStyle w:val="Hyperlink"/>
-                  <w:lang w:val="en-US"/>
-                </w:rPr>
-                <w:t>transparant</w:t>
-              </w:r>
-              <w:proofErr w:type="spellEnd"/>
-              <w:r>
-                <w:rPr>
-                  <w:rStyle w:val="Hyperlink"/>
-                  <w:lang w:val="en-US"/>
-                </w:rPr>
-                <w:t xml:space="preserve"> about the use of GenAI</w:t>
+                <w:t>page on being transparant about the use of GenAI</w:t>
               </w:r>
             </w:hyperlink>
             <w:r>
@@ -3038,29 +2964,13 @@
               </w:rPr>
               <w:t xml:space="preserve">the instructions on the </w:t>
             </w:r>
-            <w:hyperlink r:id="rId29" w:anchor="Transparency" w:tooltip="https://www.kuleuven.be/english/education/student/educational-tools/generative-artificial-intelligence#Transparency" w:history="1">
+            <w:hyperlink r:id="rId31" w:anchor="Transparency" w:tooltip="https://www.kuleuven.be/english/education/student/educational-tools/generative-artificial-intelligence#Transparency" w:history="1">
               <w:r>
                 <w:rPr>
                   <w:rStyle w:val="Hyperlink"/>
                   <w:lang w:val="en-US"/>
                 </w:rPr>
-                <w:t xml:space="preserve">page on being </w:t>
-              </w:r>
-              <w:proofErr w:type="spellStart"/>
-              <w:r>
-                <w:rPr>
-                  <w:rStyle w:val="Hyperlink"/>
-                  <w:lang w:val="en-US"/>
-                </w:rPr>
-                <w:t>transparant</w:t>
-              </w:r>
-              <w:proofErr w:type="spellEnd"/>
-              <w:r>
-                <w:rPr>
-                  <w:rStyle w:val="Hyperlink"/>
-                  <w:lang w:val="en-US"/>
-                </w:rPr>
-                <w:t xml:space="preserve"> about the use of GenAI</w:t>
+                <w:t>page on being transparant about the use of GenAI</w:t>
               </w:r>
             </w:hyperlink>
             <w:r>
@@ -3118,7 +3028,7 @@
               </w:rPr>
               <w:t xml:space="preserve">If so, that existing work should be correctly </w:t>
             </w:r>
-            <w:hyperlink r:id="rId30" w:tooltip="https://bib.kuleuven.be/english/training-and-tutorials/citation" w:history="1">
+            <w:hyperlink r:id="rId32" w:tooltip="https://bib.kuleuven.be/english/training-and-tutorials/citation" w:history="1">
               <w:r>
                 <w:rPr>
                   <w:rStyle w:val="Hyperlink"/>
@@ -3153,7 +3063,7 @@
               </w:rPr>
               <w:t xml:space="preserve">be committing </w:t>
             </w:r>
-            <w:hyperlink r:id="rId31" w:tooltip="https://www.kuleuven.be/english/education/plagiarism/index" w:history="1">
+            <w:hyperlink r:id="rId33" w:tooltip="https://www.kuleuven.be/english/education/plagiarism/index" w:history="1">
               <w:r>
                 <w:rPr>
                   <w:rStyle w:val="Hyperlink"/>
@@ -3280,29 +3190,13 @@
               </w:rPr>
               <w:t xml:space="preserve">the instructions on the </w:t>
             </w:r>
-            <w:hyperlink r:id="rId32" w:anchor="Transparency" w:tooltip="https://www.kuleuven.be/english/education/student/educational-tools/generative-artificial-intelligence#Transparency" w:history="1">
+            <w:hyperlink r:id="rId34" w:anchor="Transparency" w:tooltip="https://www.kuleuven.be/english/education/student/educational-tools/generative-artificial-intelligence#Transparency" w:history="1">
               <w:r>
                 <w:rPr>
                   <w:rStyle w:val="Hyperlink"/>
                   <w:lang w:val="en-US"/>
                 </w:rPr>
-                <w:t xml:space="preserve">page on being </w:t>
-              </w:r>
-              <w:proofErr w:type="spellStart"/>
-              <w:r>
-                <w:rPr>
-                  <w:rStyle w:val="Hyperlink"/>
-                  <w:lang w:val="en-US"/>
-                </w:rPr>
-                <w:t>transparant</w:t>
-              </w:r>
-              <w:proofErr w:type="spellEnd"/>
-              <w:r>
-                <w:rPr>
-                  <w:rStyle w:val="Hyperlink"/>
-                  <w:lang w:val="en-US"/>
-                </w:rPr>
-                <w:t xml:space="preserve"> about the use of GenAI</w:t>
+                <w:t>page on being transparant about the use of GenAI</w:t>
               </w:r>
             </w:hyperlink>
             <w:r>
@@ -3511,29 +3405,13 @@
               </w:rPr>
               <w:t xml:space="preserve">the instructions </w:t>
             </w:r>
-            <w:hyperlink r:id="rId33" w:anchor="Transparency" w:tooltip="https://www.kuleuven.be/english/education/student/educational-tools/generative-artificial-intelligence#Transparency" w:history="1">
+            <w:hyperlink r:id="rId35" w:anchor="Transparency" w:tooltip="https://www.kuleuven.be/english/education/student/educational-tools/generative-artificial-intelligence#Transparency" w:history="1">
               <w:r>
                 <w:rPr>
                   <w:rStyle w:val="Hyperlink"/>
                   <w:lang w:val="en-US"/>
                 </w:rPr>
-                <w:t xml:space="preserve">page on being </w:t>
-              </w:r>
-              <w:proofErr w:type="spellStart"/>
-              <w:r>
-                <w:rPr>
-                  <w:rStyle w:val="Hyperlink"/>
-                  <w:lang w:val="en-US"/>
-                </w:rPr>
-                <w:t>transparant</w:t>
-              </w:r>
-              <w:proofErr w:type="spellEnd"/>
-              <w:r>
-                <w:rPr>
-                  <w:rStyle w:val="Hyperlink"/>
-                  <w:lang w:val="en-US"/>
-                </w:rPr>
-                <w:t xml:space="preserve"> about the use of GenAI</w:t>
+                <w:t>page on being transparant about the use of GenAI</w:t>
               </w:r>
             </w:hyperlink>
             <w:r>
@@ -3698,7 +3576,7 @@
               </w:rPr>
               <w:t xml:space="preserve">efer to GenAI for visuals according to the usual referencing style, following the instructions on the </w:t>
             </w:r>
-            <w:hyperlink r:id="rId34" w:tooltip="https://bib.kuleuven.be/english/training-and-tutorials/citation/refering-to-genai" w:history="1">
+            <w:hyperlink r:id="rId36" w:tooltip="https://bib.kuleuven.be/english/training-and-tutorials/citation/refering-to-genai" w:history="1">
               <w:r>
                 <w:rPr>
                   <w:rStyle w:val="Hyperlink"/>
@@ -3743,7 +3621,7 @@
               </w:rPr>
               <w:t xml:space="preserve"> that existing work should be correctly </w:t>
             </w:r>
-            <w:hyperlink r:id="rId35" w:tooltip="https://bib.kuleuven.be/english/training-and-tutorials/citation" w:history="1">
+            <w:hyperlink r:id="rId37" w:tooltip="https://bib.kuleuven.be/english/training-and-tutorials/citation" w:history="1">
               <w:r>
                 <w:rPr>
                   <w:rStyle w:val="Hyperlink"/>
@@ -3778,7 +3656,7 @@
               </w:rPr>
               <w:t xml:space="preserve">be committing </w:t>
             </w:r>
-            <w:hyperlink r:id="rId36" w:tooltip="https://www.kuleuven.be/english/education/plagiarism/index" w:history="1">
+            <w:hyperlink r:id="rId38" w:tooltip="https://www.kuleuven.be/english/education/plagiarism/index" w:history="1">
               <w:r>
                 <w:rPr>
                   <w:rStyle w:val="Hyperlink"/>
@@ -3921,7 +3799,7 @@
               <w:lastRenderedPageBreak/>
               <w:t xml:space="preserve">Motivate how you would comply with Article 84 of the exam regulations. Explain the use and the added value of the AI tool you consider to use and how it is in accordance with the assignment or thesis and the </w:t>
             </w:r>
-            <w:hyperlink r:id="rId37" w:tooltip="https://www.kuleuven.be/english/genai" w:history="1">
+            <w:hyperlink r:id="rId39" w:tooltip="https://www.kuleuven.be/english/genai" w:history="1">
               <w:r>
                 <w:rPr>
                   <w:rStyle w:val="Hyperlink"/>
@@ -3959,29 +3837,13 @@
               </w:rPr>
               <w:t xml:space="preserve">in accordance with the instructions </w:t>
             </w:r>
-            <w:hyperlink r:id="rId38" w:anchor="Transparency" w:tooltip="https://www.kuleuven.be/english/education/student/educational-tools/generative-artificial-intelligence#Transparency" w:history="1">
+            <w:hyperlink r:id="rId40" w:anchor="Transparency" w:tooltip="https://www.kuleuven.be/english/education/student/educational-tools/generative-artificial-intelligence#Transparency" w:history="1">
               <w:r>
                 <w:rPr>
                   <w:rStyle w:val="Hyperlink"/>
                   <w:lang w:val="en-US"/>
                 </w:rPr>
-                <w:t xml:space="preserve">page on being </w:t>
-              </w:r>
-              <w:proofErr w:type="spellStart"/>
-              <w:r>
-                <w:rPr>
-                  <w:rStyle w:val="Hyperlink"/>
-                  <w:lang w:val="en-US"/>
-                </w:rPr>
-                <w:t>transparant</w:t>
-              </w:r>
-              <w:proofErr w:type="spellEnd"/>
-              <w:r>
-                <w:rPr>
-                  <w:rStyle w:val="Hyperlink"/>
-                  <w:lang w:val="en-US"/>
-                </w:rPr>
-                <w:t xml:space="preserve"> about the use of GenAI</w:t>
+                <w:t>page on being transparant about the use of GenAI</w:t>
               </w:r>
             </w:hyperlink>
             <w:r>
@@ -4013,7 +3875,7 @@
       </w:pPr>
     </w:p>
     <w:sectPr>
-      <w:footerReference w:type="default" r:id="rId39"/>
+      <w:footerReference w:type="default" r:id="rId41"/>
       <w:pgSz w:w="16838" w:h="11906" w:orient="landscape"/>
       <w:pgMar w:top="720" w:right="720" w:bottom="720" w:left="720" w:header="708" w:footer="1345" w:gutter="0"/>
       <w:cols w:space="708"/>
@@ -5999,7 +5861,6 @@
   <w:style w:type="character" w:default="1" w:styleId="DefaultParagraphFont">
     <w:name w:val="Default Paragraph Font"/>
     <w:uiPriority w:val="1"/>
-    <w:semiHidden/>
     <w:unhideWhenUsed/>
   </w:style>
   <w:style w:type="table" w:default="1" w:styleId="TableNormal">
@@ -17823,6 +17684,29 @@
 </file>
 
 <file path=customXml/item1.xml><?xml version="1.0" encoding="utf-8"?>
+<b:Sources xmlns:b="http://schemas.openxmlformats.org/officeDocument/2006/bibliography" xmlns="http://schemas.openxmlformats.org/officeDocument/2006/bibliography" SelectedStyle="\APASixthEditionOfficeOnline.xsl" StyleName="APA" Version="6"/>
+</file>
+
+<file path=customXml/item2.xml><?xml version="1.0" encoding="utf-8"?>
+<?mso-contentType ?>
+<FormTemplates xmlns="http://schemas.microsoft.com/sharepoint/v3/contenttype/forms">
+  <Display>DocumentLibraryForm</Display>
+  <Edit>DocumentLibraryForm</Edit>
+  <New>DocumentLibraryForm</New>
+</FormTemplates>
+</file>
+
+<file path=customXml/item3.xml><?xml version="1.0" encoding="utf-8"?>
+<p:properties xmlns:p="http://schemas.microsoft.com/office/2006/metadata/properties" xmlns:xsi="http://www.w3.org/2001/XMLSchema-instance" xmlns:pc="http://schemas.microsoft.com/office/infopath/2007/PartnerControls">
+  <documentManagement>
+    <lcf76f155ced4ddcb4097134ff3c332f xmlns="09a95e20-259e-43b2-8648-99ec21a3a5ce">
+      <Terms xmlns="http://schemas.microsoft.com/office/infopath/2007/PartnerControls"/>
+    </lcf76f155ced4ddcb4097134ff3c332f>
+  </documentManagement>
+</p:properties>
+</file>
+
+<file path=customXml/item4.xml><?xml version="1.0" encoding="utf-8"?>
 <ct:contentTypeSchema xmlns:ct="http://schemas.microsoft.com/office/2006/metadata/contentType" xmlns:ma="http://schemas.microsoft.com/office/2006/metadata/properties/metaAttributes" ct:_="" ma:_="" ma:contentTypeName="Document" ma:contentTypeID="0x010100C716486488F8A3489750D63DDC4FAC04" ma:contentTypeVersion="10" ma:contentTypeDescription="Een nieuw document maken." ma:contentTypeScope="" ma:versionID="f750bf31995c20f45ee86359f8380f30">
   <xsd:schema xmlns:xsd="http://www.w3.org/2001/XMLSchema" xmlns:xs="http://www.w3.org/2001/XMLSchema" xmlns:p="http://schemas.microsoft.com/office/2006/metadata/properties" xmlns:ns2="09a95e20-259e-43b2-8648-99ec21a3a5ce" targetNamespace="http://schemas.microsoft.com/office/2006/metadata/properties" ma:root="true" ma:fieldsID="9b7df407231c270903648bf95ac226c3" ns2:_="">
     <xsd:import namespace="09a95e20-259e-43b2-8648-99ec21a3a5ce"/>
@@ -17998,30 +17882,33 @@
 </ct:contentTypeSchema>
 </file>
 
-<file path=customXml/item2.xml><?xml version="1.0" encoding="utf-8"?>
-<p:properties xmlns:p="http://schemas.microsoft.com/office/2006/metadata/properties" xmlns:xsi="http://www.w3.org/2001/XMLSchema-instance" xmlns:pc="http://schemas.microsoft.com/office/infopath/2007/PartnerControls">
-  <documentManagement>
-    <lcf76f155ced4ddcb4097134ff3c332f xmlns="09a95e20-259e-43b2-8648-99ec21a3a5ce">
-      <Terms xmlns="http://schemas.microsoft.com/office/infopath/2007/PartnerControls"/>
-    </lcf76f155ced4ddcb4097134ff3c332f>
-  </documentManagement>
-</p:properties>
+<file path=customXml/itemProps1.xml><?xml version="1.0" encoding="utf-8"?>
+<ds:datastoreItem xmlns:ds="http://schemas.openxmlformats.org/officeDocument/2006/customXml" ds:itemID="{072B0C5E-DADC-4892-81AC-B00040DD147E}">
+  <ds:schemaRefs>
+    <ds:schemaRef ds:uri="http://schemas.openxmlformats.org/officeDocument/2006/bibliography"/>
+  </ds:schemaRefs>
+</ds:datastoreItem>
 </file>
 
-<file path=customXml/item3.xml><?xml version="1.0" encoding="utf-8"?>
-<?mso-contentType ?>
-<FormTemplates xmlns="http://schemas.microsoft.com/sharepoint/v3/contenttype/forms">
-  <Display>DocumentLibraryForm</Display>
-  <Edit>DocumentLibraryForm</Edit>
-  <New>DocumentLibraryForm</New>
-</FormTemplates>
+<file path=customXml/itemProps2.xml><?xml version="1.0" encoding="utf-8"?>
+<ds:datastoreItem xmlns:ds="http://schemas.openxmlformats.org/officeDocument/2006/customXml" ds:itemID="{84E96D00-AEB8-4B8D-AE1F-71F6637BC9B6}">
+  <ds:schemaRefs>
+    <ds:schemaRef ds:uri="http://schemas.microsoft.com/sharepoint/v3/contenttype/forms"/>
+  </ds:schemaRefs>
+</ds:datastoreItem>
 </file>
 
-<file path=customXml/item4.xml><?xml version="1.0" encoding="utf-8"?>
-<b:Sources xmlns:b="http://schemas.openxmlformats.org/officeDocument/2006/bibliography" xmlns="http://schemas.openxmlformats.org/officeDocument/2006/bibliography" SelectedStyle="\APASixthEditionOfficeOnline.xsl" StyleName="APA" Version="6"/>
+<file path=customXml/itemProps3.xml><?xml version="1.0" encoding="utf-8"?>
+<ds:datastoreItem xmlns:ds="http://schemas.openxmlformats.org/officeDocument/2006/customXml" ds:itemID="{584FA3C7-8FC8-4398-ADE9-9D88655A8170}">
+  <ds:schemaRefs>
+    <ds:schemaRef ds:uri="http://schemas.microsoft.com/office/2006/metadata/properties"/>
+    <ds:schemaRef ds:uri="http://schemas.microsoft.com/office/infopath/2007/PartnerControls"/>
+    <ds:schemaRef ds:uri="09a95e20-259e-43b2-8648-99ec21a3a5ce"/>
+  </ds:schemaRefs>
+</ds:datastoreItem>
 </file>
 
-<file path=customXml/itemProps1.xml><?xml version="1.0" encoding="utf-8"?>
+<file path=customXml/itemProps4.xml><?xml version="1.0" encoding="utf-8"?>
 <ds:datastoreItem xmlns:ds="http://schemas.openxmlformats.org/officeDocument/2006/customXml" ds:itemID="{9A366E90-3E2D-4CC5-917E-BEA018A4742C}">
   <ds:schemaRefs>
     <ds:schemaRef ds:uri="http://schemas.microsoft.com/office/2006/metadata/contentType"/>
@@ -18037,30 +17924,4 @@
     <ds:schemaRef ds:uri="http://schemas.microsoft.com/internal/obd"/>
   </ds:schemaRefs>
 </ds:datastoreItem>
-</file>
-
-<file path=customXml/itemProps2.xml><?xml version="1.0" encoding="utf-8"?>
-<ds:datastoreItem xmlns:ds="http://schemas.openxmlformats.org/officeDocument/2006/customXml" ds:itemID="{584FA3C7-8FC8-4398-ADE9-9D88655A8170}">
-  <ds:schemaRefs>
-    <ds:schemaRef ds:uri="http://schemas.microsoft.com/office/2006/metadata/properties"/>
-    <ds:schemaRef ds:uri="http://schemas.microsoft.com/office/infopath/2007/PartnerControls"/>
-    <ds:schemaRef ds:uri="09a95e20-259e-43b2-8648-99ec21a3a5ce"/>
-  </ds:schemaRefs>
-</ds:datastoreItem>
-</file>
-
-<file path=customXml/itemProps3.xml><?xml version="1.0" encoding="utf-8"?>
-<ds:datastoreItem xmlns:ds="http://schemas.openxmlformats.org/officeDocument/2006/customXml" ds:itemID="{84E96D00-AEB8-4B8D-AE1F-71F6637BC9B6}">
-  <ds:schemaRefs>
-    <ds:schemaRef ds:uri="http://schemas.microsoft.com/sharepoint/v3/contenttype/forms"/>
-  </ds:schemaRefs>
-</ds:datastoreItem>
-</file>
-
-<file path=customXml/itemProps4.xml><?xml version="1.0" encoding="utf-8"?>
-<ds:datastoreItem xmlns:ds="http://schemas.openxmlformats.org/officeDocument/2006/customXml" ds:itemID="{072B0C5E-DADC-4892-81AC-B00040DD147E}">
-  <ds:schemaRefs>
-    <ds:schemaRef ds:uri="http://schemas.openxmlformats.org/officeDocument/2006/bibliography"/>
-  </ds:schemaRefs>
-</ds:datastoreItem>
 </file>
</xml_diff>